<commit_message>
Update scorecard: $72K retirement cap, S-Corp wording, entity question text
- Changed retirement plan references from $69K to $72K
- Rewrote S-Corp recommendation to "well-run S Corp could reduce
  your total tax bill by thousands"
- Changed entity question from "business structured" to "income structured"
- Updated audit doc and generation script to match

https://claude.ai/code/session_01Fn4wWrXZEFnKRBtdM5MdJC
</commit_message>
<xml_diff>
--- a/Scorecard_Audit.docx
+++ b/Scorecard_Audit.docx
@@ -322,7 +322,7 @@
     </w:p>
     <w:p>
       <w:r>
-        <w:t>Question text:  How is your business currently structured?</w:t>
+        <w:t>Question text:  How is your income currently structured?</w:t>
       </w:r>
     </w:p>
     <w:p>
@@ -2897,7 +2897,7 @@
           </w:tcPr>
           <w:p>
             <w:r>
-              <w:t>Solo 401(k) sheltering up to $69K/yr tax-deferred</w:t>
+              <w:t>Solo 401(k) sheltering up to $72K/yr tax-deferred</w:t>
             </w:r>
           </w:p>
         </w:tc>
@@ -2966,7 +2966,7 @@
           </w:tcPr>
           <w:p>
             <w:r>
-              <w:t>Maxed-out retirement plan sheltering up to $69K/yr</w:t>
+              <w:t>Maxed-out retirement plan sheltering up to $72K/yr</w:t>
             </w:r>
           </w:p>
         </w:tc>
@@ -3431,7 +3431,7 @@
     </w:p>
     <w:p>
       <w:r>
-        <w:t>You're earning [income bracket] on a [entity label] — an S-Corp election could reduce your self-employment taxes by $15,000 to $40,000+ per year. This is likely your single biggest savings opportunity.</w:t>
+        <w:t>You're earning [income bracket] on a [entity label] — a well-run S Corp could reduce your total tax bill by thousands (if not tens of thousands) of dollars per year. This is likely your single biggest savings opportunity.</w:t>
       </w:r>
     </w:p>
     <w:p/>
@@ -3567,7 +3567,7 @@
     </w:p>
     <w:p>
       <w:r>
-        <w:t>Without a business retirement plan, you're missing out on one of the best tax shelters available. A Solo 401(k) could let you defer up to $69,000/year in pre-tax income.</w:t>
+        <w:t>Without a business retirement plan, you're missing out on one of the best tax shelters available. A Solo 401(k) could let you defer up to $72,000/year in pre-tax income.</w:t>
       </w:r>
     </w:p>
     <w:p/>

</xml_diff>